<commit_message>
Final reports: describe samples as bulk pure biomarker; remove neat powder and on-glass-slide wording
Co-Authored-By: Claude Sonnet 5.5 <noreply@anthropic.com>
</commit_message>
<xml_diff>
--- a/Final_Submission/01_Bulk_Experimental_Reports/LPS_Bulk_Spectral_Analysis.docx
+++ b/Final_Submission/01_Bulk_Experimental_Reports/LPS_Bulk_Spectral_Analysis.docx
@@ -23,7 +23,7 @@
           <w:color w:val="404040"/>
           <w:sz w:val="23"/>
         </w:rPr>
-        <w:t>Reference spectrum of the neat powder on a glass slide</w:t>
+        <w:t>Reference spectrum of the bulk pure biomarker</w:t>
       </w:r>
     </w:p>
     <w:p>
@@ -44,7 +44,7 @@
     </w:p>
     <w:p>
       <w:r>
-        <w:t>Lipopolysaccharide (LPS) is the main lipid-sugar molecule of the outer membrane of Gram-negative bacteria (endotoxin), a trigger of sepsis. Its Raman fingerprint was established from 10 spectra of the neat powder recorded at one setting (60 % of maximum laser power, 40 s integration, 5 accumulations). The spectrum has one clearly strongest peak at 425 cm⁻¹ and weaker peaks near 766, 861, 996 and 1080 cm⁻¹. The 425 cm⁻¹ peak is present in every spectrum; the weaker peaks are present in 8 to 10 of the 10.</w:t>
+        <w:t>Lipopolysaccharide (LPS) is the main lipid-sugar molecule of the outer membrane of Gram-negative bacteria (endotoxin), a trigger of sepsis. Its Raman fingerprint was established from 10 spectra of the bulk pure biomarker recorded at one setting (60 % of maximum laser power, 40 s integration, 5 accumulations). The spectrum has one clearly strongest peak at 425 cm⁻¹ and weaker peaks near 766, 861, 996 and 1080 cm⁻¹. The 425 cm⁻¹ peak is present in every spectrum; the weaker peaks are present in 8 to 10 of the 10.</w:t>
       </w:r>
     </w:p>
     <w:p>
@@ -62,7 +62,7 @@
     </w:p>
     <w:p>
       <w:r>
-        <w:t>To record a reliable, repeatable Raman spectrum of lipopolysaccharide (LPS) as a neat powder, to identify its characteristic peaks, and to confirm that those peaks come from the molecule and not from the glass slide on which it was measured. This spectrum is the experimental reference for comparison with the molecular simulation and for later detection work.</w:t>
+        <w:t>To record a reliable, repeatable Raman spectrum of lipopolysaccharide (LPS) as a bulk pure biomarker, to identify its characteristic peaks, and to confirm that those peaks come from the molecule and not from the glass background of the measurement. This spectrum is the experimental reference for comparison with the molecular simulation and for later detection work.</w:t>
       </w:r>
     </w:p>
     <w:p>
@@ -83,7 +83,7 @@
     </w:p>
     <w:p>
       <w:r>
-        <w:t>Sample: lipopolysaccharide from Escherichia coli O111:B4 (Sigma-Aldrich L2630). The powder was placed on a clean glass slide and measured with a 785 nm Raman instrument (B&amp;W Tek i-Raman Plus). Laser power is given as a percentage of the instrument maximum. Reference condition: 60 % of maximum laser power, 40 s integration, 5 accumulations. Each file is one spectrum, averaged over its accumulations; the number of independent measurement spots is stated where it matters.</w:t>
+        <w:t>Sample: lipopolysaccharide from Escherichia coli O111:B4 (Sigma-Aldrich L2630). The bulk pure biomarker was measured with a 785 nm Raman instrument (B&amp;W Tek i-Raman Plus). Laser power is given as a percentage of the instrument maximum. Reference condition: 60 % of maximum laser power, 40 s integration, 5 accumulations. Each file is one spectrum, averaged over its accumulations; the number of independent measurement spots is stated where it matters.</w:t>
       </w:r>
     </w:p>
     <w:p>
@@ -251,7 +251,7 @@
         <w:rPr>
           <w:sz w:val="19"/>
         </w:rPr>
-        <w:t>Raman spectra of lipopolysaccharide (LPS) powder. Thin lines: each of the 10 spectra; bold line: mean; shaded band: ± 1 standard deviation. Numbers mark the main and supporting peaks. Grey: glass-slide zone.</w:t>
+        <w:t>Raman spectra of bulk pure lipopolysaccharide (LPS). Thin lines: each of the 10 spectra; bold line: mean; shaded band: ± 1 standard deviation. Numbers mark the main and supporting peaks. Grey: glass-slide zone.</w:t>
       </w:r>
     </w:p>
     <w:p>
@@ -935,7 +935,7 @@
         <w:rPr>
           <w:sz w:val="19"/>
         </w:rPr>
-        <w:t>The sample on glass compared with the glass slide alone. Top: signal in counts, same settings. Bottom: both normalised. Grey: the glass zone; dotted lines mark the LPS peaks.</w:t>
+        <w:t>The bulk sample compared with the glass blank. Top: signal in counts, same settings. Bottom: both normalised. Grey: the glass zone; dotted lines mark the LPS peaks.</w:t>
       </w:r>
     </w:p>
     <w:p>

</xml_diff>